<commit_message>
Add cross-tool nav, deny-blocking audit, WEL support, OSPF/BGP key redaction
Cross-tool navigation across all 6 tools, 3 more vendor signatures in
the hub's drag-drop detector, a Comware QinQ round-trip fix, a new
firewall audit rule for rules blocked by an earlier deny, a config
diff feature in the switch analyzer, Windows Event Log parsing in the
log analyzer, OSPF/BGP MD5 key redaction for more config-anonymizer
vendors, and refreshed usage guides for all 6 tools.
</commit_message>
<xml_diff>
--- a/docs/config-anonymizer-guide.docx
+++ b/docs/config-anonymizer-guide.docx
@@ -41,8 +41,20 @@
       </w:r>
     </w:p>
     <w:p>
+      <w:pPr/>
+      <w:r>
+        <w:t>🧭 跨工具導覽：右上角「🧭」按鈕可快速切換至其餘 5 個工具（總覽首頁、交換器解析、交換器產生器、防火牆分析、日誌分析），無需返回首頁重新選擇。</w:t>
+      </w:r>
+    </w:p>
+    <w:p>
       <w:r>
         <w:t>🌐 介面語言：支援繁體中文 / English / 日本語 三語切換（右上角語言按鈕）。</w:t>
+      </w:r>
+    </w:p>
+    <w:p>
+      <w:pPr/>
+      <w:r>
+        <w:t>⚠ OSPF/BGP MD5 認證金鑰：FortiGate／FortiSwitch／Check Point／MikroTik／Zyxel／EdgeRouter／Comware／Aruba CX／Dell OS10 共 9 家已支援強制替換；其餘廠牌因查無官方文件佐證或架構上不適用（如 OpenWrt UCI 無內建動態路由），暫不處理，詳見殘留檢查提示。</w:t>
       </w:r>
     </w:p>
     <w:p>

</xml_diff>